<commit_message>
v2.2: 新增第十章一键启动脚本 + start-openclaw.bat/ps1
</commit_message>
<xml_diff>
--- a/OpenClaw安装及问题解决.docx
+++ b/OpenClaw安装及问题解决.docx
@@ -2967,7 +2967,343 @@
         <w:pStyle w:val="Heading1"/>
       </w:pPr>
       <w:r>
-        <w:t xml:space="preserve">十、实用 Skills 推荐</w:t>
+        <w:t xml:space="preserve">十、一键启动脚本</w:t>
+      </w:r>
+    </w:p>
+    <w:p>
+      <w:pPr>
+        <w:spacing w:after="100"/>
+      </w:pPr>
+      <w:r>
+        <w:t xml:space="preserve">为了方便每次启动 OpenClaw，提供两个一键启动脚本，放在桌面双击即可。</w:t>
+      </w:r>
+    </w:p>
+    <w:p>
+      <w:pPr>
+        <w:spacing w:before="40"/>
+      </w:pPr>
+    </w:p>
+    <w:p>
+      <w:pPr>
+        <w:pStyle w:val="Heading2"/>
+      </w:pPr>
+      <w:r>
+        <w:t xml:space="preserve">10.1 Windows 批处理版 (start-openclaw.bat)</w:t>
+      </w:r>
+    </w:p>
+    <w:p>
+      <w:pPr>
+        <w:spacing w:after="100"/>
+      </w:pPr>
+      <w:r>
+        <w:t xml:space="preserve">双击运行，自动完成：Ollama 检查 → Gateway 启动 → Watchdog 守护</w:t>
+      </w:r>
+    </w:p>
+    <w:p>
+      <w:pPr>
+        <w:pBdr>
+          <w:left w:val="single" w:color="2E75B6" w:sz="12" w:space="8"/>
+        </w:pBdr>
+        <w:shd w:fill="F5F5F5" w:val="clear"/>
+        <w:spacing w:after="60" w:before="60"/>
+        <w:ind w:left="480"/>
+      </w:pPr>
+      <w:r>
+        <w:rPr>
+          <w:rFonts w:ascii="Consolas" w:cs="Consolas" w:eastAsia="Consolas" w:hAnsi="Consolas"/>
+          <w:color w:val="333333"/>
+          <w:sz w:val="18"/>
+          <w:szCs w:val="18"/>
+        </w:rPr>
+        <w:t xml:space="preserve">@echo off</w:t>
+      </w:r>
+    </w:p>
+    <w:p>
+      <w:pPr>
+        <w:pBdr>
+          <w:left w:val="single" w:color="2E75B6" w:sz="12" w:space="8"/>
+        </w:pBdr>
+        <w:shd w:fill="F5F5F5" w:val="clear"/>
+        <w:spacing w:after="60" w:before="60"/>
+        <w:ind w:left="480"/>
+      </w:pPr>
+      <w:r>
+        <w:rPr>
+          <w:rFonts w:ascii="Consolas" w:cs="Consolas" w:eastAsia="Consolas" w:hAnsi="Consolas"/>
+          <w:color w:val="333333"/>
+          <w:sz w:val="18"/>
+          <w:szCs w:val="18"/>
+        </w:rPr>
+        <w:t xml:space="preserve">:: 检查 Ollama 服务</w:t>
+      </w:r>
+    </w:p>
+    <w:p>
+      <w:pPr>
+        <w:pBdr>
+          <w:left w:val="single" w:color="2E75B6" w:sz="12" w:space="8"/>
+        </w:pBdr>
+        <w:shd w:fill="F5F5F5" w:val="clear"/>
+        <w:spacing w:after="60" w:before="60"/>
+        <w:ind w:left="480"/>
+      </w:pPr>
+      <w:r>
+        <w:rPr>
+          <w:rFonts w:ascii="Consolas" w:cs="Consolas" w:eastAsia="Consolas" w:hAnsi="Consolas"/>
+          <w:color w:val="333333"/>
+          <w:sz w:val="18"/>
+          <w:szCs w:val="18"/>
+        </w:rPr>
+        <w:t xml:space="preserve">curl -s http://127.0.0.1:11434/api/tags &gt;nul</w:t>
+      </w:r>
+    </w:p>
+    <w:p>
+      <w:pPr>
+        <w:pBdr>
+          <w:left w:val="single" w:color="2E75B6" w:sz="12" w:space="8"/>
+        </w:pBdr>
+        <w:shd w:fill="F5F5F5" w:val="clear"/>
+        <w:spacing w:after="60" w:before="60"/>
+        <w:ind w:left="480"/>
+      </w:pPr>
+      <w:r>
+        <w:rPr>
+          <w:rFonts w:ascii="Consolas" w:cs="Consolas" w:eastAsia="Consolas" w:hAnsi="Consolas"/>
+          <w:color w:val="333333"/>
+          <w:sz w:val="18"/>
+          <w:szCs w:val="18"/>
+        </w:rPr>
+        <w:t xml:space="preserve">:: 启动 ClawX Gateway</w:t>
+      </w:r>
+    </w:p>
+    <w:p>
+      <w:pPr>
+        <w:pBdr>
+          <w:left w:val="single" w:color="2E75B6" w:sz="12" w:space="8"/>
+        </w:pBdr>
+        <w:shd w:fill="F5F5F5" w:val="clear"/>
+        <w:spacing w:after="60" w:before="60"/>
+        <w:ind w:left="480"/>
+      </w:pPr>
+      <w:r>
+        <w:rPr>
+          <w:rFonts w:ascii="Consolas" w:cs="Consolas" w:eastAsia="Consolas" w:hAnsi="Consolas"/>
+          <w:color w:val="333333"/>
+          <w:sz w:val="18"/>
+          <w:szCs w:val="18"/>
+        </w:rPr>
+        <w:t xml:space="preserve">start "" "%LOCALAPPDATA%\Programs\ClawX\ClawX.exe"</w:t>
+      </w:r>
+    </w:p>
+    <w:p>
+      <w:pPr>
+        <w:pBdr>
+          <w:left w:val="single" w:color="2E75B6" w:sz="12" w:space="8"/>
+        </w:pBdr>
+        <w:shd w:fill="F5F5F5" w:val="clear"/>
+        <w:spacing w:after="60" w:before="60"/>
+        <w:ind w:left="480"/>
+      </w:pPr>
+      <w:r>
+        <w:rPr>
+          <w:rFonts w:ascii="Consolas" w:cs="Consolas" w:eastAsia="Consolas" w:hAnsi="Consolas"/>
+          <w:color w:val="333333"/>
+          <w:sz w:val="18"/>
+          <w:szCs w:val="18"/>
+        </w:rPr>
+        <w:t xml:space="preserve">:: 启动 Watchdog 守护</w:t>
+      </w:r>
+    </w:p>
+    <w:p>
+      <w:pPr>
+        <w:pBdr>
+          <w:left w:val="single" w:color="2E75B6" w:sz="12" w:space="8"/>
+        </w:pBdr>
+        <w:shd w:fill="F5F5F5" w:val="clear"/>
+        <w:spacing w:after="60" w:before="60"/>
+        <w:ind w:left="480"/>
+      </w:pPr>
+      <w:r>
+        <w:rPr>
+          <w:rFonts w:ascii="Consolas" w:cs="Consolas" w:eastAsia="Consolas" w:hAnsi="Consolas"/>
+          <w:color w:val="333333"/>
+          <w:sz w:val="18"/>
+          <w:szCs w:val="18"/>
+        </w:rPr>
+        <w:t xml:space="preserve">start "" powershell -File "%USERPROFILE%\.openclaw\workspace\scripts\gateway-watchdog.ps1"</w:t>
+      </w:r>
+    </w:p>
+    <w:p>
+      <w:pPr>
+        <w:spacing w:after="100"/>
+      </w:pPr>
+      <w:r>
+        <w:t xml:space="preserve">下载地址：</w:t>
+      </w:r>
+    </w:p>
+    <w:p>
+      <w:pPr>
+        <w:pStyle w:val="ListParagraph"/>
+        <w:numPr>
+          <w:ilvl w:val="0"/>
+          <w:numId w:val="3"/>
+        </w:numPr>
+      </w:pPr>
+      <w:r>
+        <w:rPr>
+          <w:color w:val="808080"/>
+          <w:sz w:val="20"/>
+          <w:szCs w:val="20"/>
+        </w:rPr>
+        <w:t xml:space="preserve">GitHub: https://github.com/QijunLuo/openclaw-guide/blob/main/start-openclaw.bat</w:t>
+      </w:r>
+    </w:p>
+    <w:p>
+      <w:pPr>
+        <w:pBdr>
+          <w:left w:val="single" w:color="4CAF50" w:sz="12" w:space="8"/>
+        </w:pBdr>
+        <w:shd w:fill="E8F5E9" w:val="clear"/>
+        <w:spacing w:after="80" w:before="80"/>
+        <w:ind w:left="240"/>
+      </w:pPr>
+      <w:r>
+        <w:rPr>
+          <w:sz w:val="20"/>
+          <w:szCs w:val="20"/>
+        </w:rPr>
+        <w:t xml:space="preserve">💡 右键 → 另存为 → 保存到桌面，双击即可启动。</w:t>
+      </w:r>
+    </w:p>
+    <w:p>
+      <w:pPr>
+        <w:pStyle w:val="Heading2"/>
+      </w:pPr>
+      <w:r>
+        <w:t xml:space="preserve">10.2 PowerShell 版 (start-openclaw.ps1)</w:t>
+      </w:r>
+    </w:p>
+    <w:p>
+      <w:pPr>
+        <w:spacing w:after="100"/>
+      </w:pPr>
+      <w:r>
+        <w:t xml:space="preserve">功能同 bat 版，增加了彩色输出和运行状态检测。</w:t>
+      </w:r>
+    </w:p>
+    <w:p>
+      <w:pPr>
+        <w:pStyle w:val="ListParagraph"/>
+        <w:numPr>
+          <w:ilvl w:val="0"/>
+          <w:numId w:val="3"/>
+        </w:numPr>
+      </w:pPr>
+      <w:r>
+        <w:rPr>
+          <w:color w:val="808080"/>
+          <w:sz w:val="20"/>
+          <w:szCs w:val="20"/>
+        </w:rPr>
+        <w:t xml:space="preserve">下载: https://github.com/QijunLuo/openclaw-guide/blob/main/start-openclaw.ps1</w:t>
+      </w:r>
+    </w:p>
+    <w:p>
+      <w:pPr>
+        <w:pStyle w:val="ListParagraph"/>
+        <w:numPr>
+          <w:ilvl w:val="0"/>
+          <w:numId w:val="3"/>
+        </w:numPr>
+      </w:pPr>
+      <w:r>
+        <w:rPr>
+          <w:color w:val="808080"/>
+          <w:sz w:val="20"/>
+          <w:szCs w:val="20"/>
+        </w:rPr>
+        <w:t xml:space="preserve">如提示执行策略限制，先运行: Set-ExecutionPolicy RemoteSigned -Scope CurrentUser</w:t>
+      </w:r>
+    </w:p>
+    <w:p>
+      <w:pPr>
+        <w:pBdr>
+          <w:left w:val="single" w:color="FF9800" w:sz="12" w:space="8"/>
+        </w:pBdr>
+        <w:shd w:fill="FFF3E0" w:val="clear"/>
+        <w:spacing w:after="80" w:before="80"/>
+        <w:ind w:left="240"/>
+      </w:pPr>
+      <w:r>
+        <w:rPr>
+          <w:sz w:val="20"/>
+          <w:szCs w:val="20"/>
+        </w:rPr>
+        <w:t xml:space="preserve">⚠️ PowerShell 脚本首次运行需右键 → 使用 PowerShell 运行，或先解除阻止。</w:t>
+      </w:r>
+    </w:p>
+    <w:p>
+      <w:pPr>
+        <w:pStyle w:val="Heading2"/>
+      </w:pPr>
+      <w:r>
+        <w:t xml:space="preserve">10.3 设为开机自动启动</w:t>
+      </w:r>
+    </w:p>
+    <w:p>
+      <w:pPr>
+        <w:spacing w:after="100"/>
+      </w:pPr>
+      <w:r>
+        <w:t xml:space="preserve">将 start-openclaw.bat 的快捷方式放入启动文件夹：</w:t>
+      </w:r>
+    </w:p>
+    <w:p>
+      <w:pPr>
+        <w:pBdr>
+          <w:left w:val="single" w:color="2E75B6" w:sz="12" w:space="8"/>
+        </w:pBdr>
+        <w:shd w:fill="F5F5F5" w:val="clear"/>
+        <w:spacing w:after="60" w:before="60"/>
+        <w:ind w:left="480"/>
+      </w:pPr>
+      <w:r>
+        <w:rPr>
+          <w:rFonts w:ascii="Consolas" w:cs="Consolas" w:eastAsia="Consolas" w:hAnsi="Consolas"/>
+          <w:color w:val="333333"/>
+          <w:sz w:val="18"/>
+          <w:szCs w:val="18"/>
+        </w:rPr>
+        <w:t xml:space="preserve">Win + R → shell:startup → 粘贴快捷方式</w:t>
+      </w:r>
+    </w:p>
+    <w:p>
+      <w:pPr>
+        <w:pBdr>
+          <w:left w:val="single" w:color="4CAF50" w:sz="12" w:space="8"/>
+        </w:pBdr>
+        <w:shd w:fill="E8F5E9" w:val="clear"/>
+        <w:spacing w:after="80" w:before="80"/>
+        <w:ind w:left="240"/>
+      </w:pPr>
+      <w:r>
+        <w:rPr>
+          <w:sz w:val="20"/>
+          <w:szCs w:val="20"/>
+        </w:rPr>
+        <w:t xml:space="preserve">💡 配合 Watchdog 计划任务，可实现双重保障。</w:t>
+      </w:r>
+    </w:p>
+    <w:p>
+      <w:r>
+        <w:br w:type="page"/>
+      </w:r>
+    </w:p>
+    <w:p>
+      <w:pPr>
+        <w:pStyle w:val="Heading1"/>
+      </w:pPr>
+      <w:r>
+        <w:t xml:space="preserve">十一、实用 Skills 推荐</w:t>
       </w:r>
     </w:p>
     <w:p>

</xml_diff>